<commit_message>
docs(pruebas): actualiza el plan con los diagnosticos de jefatura y el cierre de la agenda a anon
</commit_message>
<xml_diff>
--- a/docs/PLAN_PRUEBAS_V3.docx
+++ b/docs/PLAN_PRUEBAS_V3.docx
@@ -3048,6 +3048,156 @@
               <w:rPr>
                 <w:sz w:val="18"/>
               </w:rPr>
+              <w:t>78</w:t>
+            </w:r>
+          </w:p>
+        </w:tc>
+      </w:tr>
+      <w:tr>
+        <w:tc>
+          <w:tcPr>
+            <w:tcW w:type="dxa" w:w="4320"/>
+          </w:tcPr>
+          <w:p>
+            <w:r/>
+            <w:r>
+              <w:rPr>
+                <w:sz w:val="18"/>
+              </w:rPr>
+              <w:t>Fase 0 (acceso, bloqueante)</w:t>
+            </w:r>
+          </w:p>
+        </w:tc>
+        <w:tc>
+          <w:tcPr>
+            <w:tcW w:type="dxa" w:w="4320"/>
+          </w:tcPr>
+          <w:p>
+            <w:r/>
+            <w:r>
+              <w:rPr>
+                <w:sz w:val="18"/>
+              </w:rPr>
+              <w:t>13</w:t>
+            </w:r>
+          </w:p>
+        </w:tc>
+      </w:tr>
+      <w:tr>
+        <w:tc>
+          <w:tcPr>
+            <w:tcW w:type="dxa" w:w="4320"/>
+          </w:tcPr>
+          <w:p>
+            <w:r/>
+            <w:r>
+              <w:rPr>
+                <w:sz w:val="18"/>
+              </w:rPr>
+              <w:t>Solo lectura</w:t>
+            </w:r>
+          </w:p>
+        </w:tc>
+        <w:tc>
+          <w:tcPr>
+            <w:tcW w:type="dxa" w:w="4320"/>
+          </w:tcPr>
+          <w:p>
+            <w:r/>
+            <w:r>
+              <w:rPr>
+                <w:sz w:val="18"/>
+              </w:rPr>
+              <w:t>57</w:t>
+            </w:r>
+          </w:p>
+        </w:tc>
+      </w:tr>
+      <w:tr>
+        <w:tc>
+          <w:tcPr>
+            <w:tcW w:type="dxa" w:w="4320"/>
+          </w:tcPr>
+          <w:p>
+            <w:r/>
+            <w:r>
+              <w:rPr>
+                <w:sz w:val="18"/>
+              </w:rPr>
+              <w:t>Escriben en la base</w:t>
+            </w:r>
+          </w:p>
+        </w:tc>
+        <w:tc>
+          <w:tcPr>
+            <w:tcW w:type="dxa" w:w="4320"/>
+          </w:tcPr>
+          <w:p>
+            <w:r/>
+            <w:r>
+              <w:rPr>
+                <w:sz w:val="18"/>
+              </w:rPr>
+              <w:t>19</w:t>
+            </w:r>
+          </w:p>
+        </w:tc>
+      </w:tr>
+      <w:tr>
+        <w:tc>
+          <w:tcPr>
+            <w:tcW w:type="dxa" w:w="4320"/>
+          </w:tcPr>
+          <w:p>
+            <w:r/>
+            <w:r>
+              <w:rPr>
+                <w:sz w:val="18"/>
+              </w:rPr>
+              <w:t>Irreversibles (append-only)</w:t>
+            </w:r>
+          </w:p>
+        </w:tc>
+        <w:tc>
+          <w:tcPr>
+            <w:tcW w:type="dxa" w:w="4320"/>
+          </w:tcPr>
+          <w:p>
+            <w:r/>
+            <w:r>
+              <w:rPr>
+                <w:sz w:val="18"/>
+              </w:rPr>
+              <w:t>2</w:t>
+            </w:r>
+          </w:p>
+        </w:tc>
+      </w:tr>
+      <w:tr>
+        <w:tc>
+          <w:tcPr>
+            <w:tcW w:type="dxa" w:w="4320"/>
+          </w:tcPr>
+          <w:p>
+            <w:r/>
+            <w:r>
+              <w:rPr>
+                <w:sz w:val="18"/>
+              </w:rPr>
+              <w:t>Regresiones de la ronda anterior</w:t>
+            </w:r>
+          </w:p>
+        </w:tc>
+        <w:tc>
+          <w:tcPr>
+            <w:tcW w:type="dxa" w:w="4320"/>
+          </w:tcPr>
+          <w:p>
+            <w:r/>
+            <w:r>
+              <w:rPr>
+                <w:sz w:val="18"/>
+              </w:rPr>
               <w:t>77</w:t>
             </w:r>
           </w:p>
@@ -3064,156 +3214,6 @@
               <w:rPr>
                 <w:sz w:val="18"/>
               </w:rPr>
-              <w:t>Fase 0 (acceso, bloqueante)</w:t>
-            </w:r>
-          </w:p>
-        </w:tc>
-        <w:tc>
-          <w:tcPr>
-            <w:tcW w:type="dxa" w:w="4320"/>
-          </w:tcPr>
-          <w:p>
-            <w:r/>
-            <w:r>
-              <w:rPr>
-                <w:sz w:val="18"/>
-              </w:rPr>
-              <w:t>13</w:t>
-            </w:r>
-          </w:p>
-        </w:tc>
-      </w:tr>
-      <w:tr>
-        <w:tc>
-          <w:tcPr>
-            <w:tcW w:type="dxa" w:w="4320"/>
-          </w:tcPr>
-          <w:p>
-            <w:r/>
-            <w:r>
-              <w:rPr>
-                <w:sz w:val="18"/>
-              </w:rPr>
-              <w:t>Solo lectura</w:t>
-            </w:r>
-          </w:p>
-        </w:tc>
-        <w:tc>
-          <w:tcPr>
-            <w:tcW w:type="dxa" w:w="4320"/>
-          </w:tcPr>
-          <w:p>
-            <w:r/>
-            <w:r>
-              <w:rPr>
-                <w:sz w:val="18"/>
-              </w:rPr>
-              <w:t>56</w:t>
-            </w:r>
-          </w:p>
-        </w:tc>
-      </w:tr>
-      <w:tr>
-        <w:tc>
-          <w:tcPr>
-            <w:tcW w:type="dxa" w:w="4320"/>
-          </w:tcPr>
-          <w:p>
-            <w:r/>
-            <w:r>
-              <w:rPr>
-                <w:sz w:val="18"/>
-              </w:rPr>
-              <w:t>Escriben en la base</w:t>
-            </w:r>
-          </w:p>
-        </w:tc>
-        <w:tc>
-          <w:tcPr>
-            <w:tcW w:type="dxa" w:w="4320"/>
-          </w:tcPr>
-          <w:p>
-            <w:r/>
-            <w:r>
-              <w:rPr>
-                <w:sz w:val="18"/>
-              </w:rPr>
-              <w:t>19</w:t>
-            </w:r>
-          </w:p>
-        </w:tc>
-      </w:tr>
-      <w:tr>
-        <w:tc>
-          <w:tcPr>
-            <w:tcW w:type="dxa" w:w="4320"/>
-          </w:tcPr>
-          <w:p>
-            <w:r/>
-            <w:r>
-              <w:rPr>
-                <w:sz w:val="18"/>
-              </w:rPr>
-              <w:t>Irreversibles (append-only)</w:t>
-            </w:r>
-          </w:p>
-        </w:tc>
-        <w:tc>
-          <w:tcPr>
-            <w:tcW w:type="dxa" w:w="4320"/>
-          </w:tcPr>
-          <w:p>
-            <w:r/>
-            <w:r>
-              <w:rPr>
-                <w:sz w:val="18"/>
-              </w:rPr>
-              <w:t>2</w:t>
-            </w:r>
-          </w:p>
-        </w:tc>
-      </w:tr>
-      <w:tr>
-        <w:tc>
-          <w:tcPr>
-            <w:tcW w:type="dxa" w:w="4320"/>
-          </w:tcPr>
-          <w:p>
-            <w:r/>
-            <w:r>
-              <w:rPr>
-                <w:sz w:val="18"/>
-              </w:rPr>
-              <w:t>Regresiones de la ronda anterior</w:t>
-            </w:r>
-          </w:p>
-        </w:tc>
-        <w:tc>
-          <w:tcPr>
-            <w:tcW w:type="dxa" w:w="4320"/>
-          </w:tcPr>
-          <w:p>
-            <w:r/>
-            <w:r>
-              <w:rPr>
-                <w:sz w:val="18"/>
-              </w:rPr>
-              <w:t>76</w:t>
-            </w:r>
-          </w:p>
-        </w:tc>
-      </w:tr>
-      <w:tr>
-        <w:tc>
-          <w:tcPr>
-            <w:tcW w:type="dxa" w:w="4320"/>
-          </w:tcPr>
-          <w:p>
-            <w:r/>
-            <w:r>
-              <w:rPr>
-                <w:sz w:val="18"/>
-              </w:rPr>
               <w:t>Defectos ya corregidos que se revalidan</w:t>
             </w:r>
           </w:p>
@@ -3228,7 +3228,7 @@
               <w:rPr>
                 <w:sz w:val="18"/>
               </w:rPr>
-              <w:t>76</w:t>
+              <w:t>77</w:t>
             </w:r>
           </w:p>
         </w:tc>
@@ -3251,7 +3251,7 @@
         <w:rPr>
           <w:b w:val="0"/>
         </w:rPr>
-        <w:t>Salieron de tus observaciones de la ronda anterior. Dos cambian lo que se espera, asi que conviene resolverlas antes de empezar a marcar.</w:t>
+        <w:t>Salieron de tus observaciones de la ronda anterior. Las que siguen abiertas cambian lo que se espera, asi que conviene resolverlas antes de empezar a marcar. Las marcadas como RESUELTAS ya se corrigieron y el plan las revalida como regresion.</w:t>
       </w:r>
     </w:p>
     <w:tbl>
@@ -3368,7 +3368,7 @@
               <w:rPr>
                 <w:sz w:val="18"/>
               </w:rPr>
-              <w:t>Solo el administrador. fn_rem_resumen lo decide con fn_es_admin().</w:t>
+              <w:t>RESUELTA. La migracion 20260930240000 cambio el gate de diagnosticos a fn_tiene_rol(array['jefatura','administrador']), el mismo del gate de la funcion. Verificado por REST: la jefatura recibe puede_ver_diagnosticos=true.</w:t>
             </w:r>
           </w:p>
         </w:tc>
@@ -3382,7 +3382,7 @@
               <w:rPr>
                 <w:sz w:val="18"/>
               </w:rPr>
-              <w:t>Cambian los casos 5.18 y 6.15, y el alcance de un rol.</w:t>
+              <w:t>Nada. Ya no es una decision: los casos 5.18 y 6.15 se prueban como regresion.</w:t>
             </w:r>
           </w:p>
         </w:tc>
@@ -3542,7 +3542,7 @@
               <w:rPr>
                 <w:sz w:val="18"/>
               </w:rPr>
-              <w:t>Solo quien administra la carga horaria los ve.</w:t>
+              <w:t>NO ERA UN DEFECTO. La politica horarios_select deja ver la agenda a cualquier autenticado, y horarios_update_staff deja editar los bloques propios. La observacion venia de una version anterior.</w:t>
             </w:r>
           </w:p>
         </w:tc>
@@ -3673,6 +3673,64 @@
                 <w:sz w:val="18"/>
               </w:rPr>
               <w:t>O se implementa la accion, o se saca el caso.</w:t>
+            </w:r>
+          </w:p>
+        </w:tc>
+      </w:tr>
+      <w:tr>
+        <w:tc>
+          <w:tcPr>
+            <w:tcW w:type="dxa" w:w="2160"/>
+          </w:tcPr>
+          <w:p>
+            <w:r/>
+            <w:r>
+              <w:rPr>
+                <w:sz w:val="18"/>
+              </w:rPr>
+              <w:t>A.7</w:t>
+            </w:r>
+          </w:p>
+        </w:tc>
+        <w:tc>
+          <w:tcPr>
+            <w:tcW w:type="dxa" w:w="2160"/>
+          </w:tcPr>
+          <w:p>
+            <w:r/>
+            <w:r>
+              <w:rPr>
+                <w:sz w:val="18"/>
+              </w:rPr>
+              <w:t>Sin iniciar sesion se podia enumerar toda la agenda de la clinica: profesional, especialidad, estado y capacidad.</w:t>
+            </w:r>
+          </w:p>
+        </w:tc>
+        <w:tc>
+          <w:tcPr>
+            <w:tcW w:type="dxa" w:w="2160"/>
+          </w:tcPr>
+          <w:p>
+            <w:r/>
+            <w:r>
+              <w:rPr>
+                <w:sz w:val="18"/>
+              </w:rPr>
+              <w:t>RESUELTA. La migracion 20260930240000 recreo la politica de lectura de horarios_disponibles como solo 'authenticated'. Verificado por REST: anon recibe cuerpo vacio, un autenticado ve los 6076 bloques.</w:t>
+            </w:r>
+          </w:p>
+        </w:tc>
+        <w:tc>
+          <w:tcPr>
+            <w:tcW w:type="dxa" w:w="2160"/>
+          </w:tcPr>
+          <w:p>
+            <w:r/>
+            <w:r>
+              <w:rPr>
+                <w:sz w:val="18"/>
+              </w:rPr>
+              <w:t>Nada. El caso 6.16 lo revalida como regresion critica.</w:t>
             </w:r>
           </w:p>
         </w:tc>
@@ -20227,7 +20285,7 @@
         <w:pStyle w:val="Heading2"/>
       </w:pPr>
       <w:r>
-        <w:t>5.18  El .csv no incluye diagnosticos</w:t>
+        <w:t>5.18  El .csv de REM incluye diagnosticos para jefatura</w:t>
       </w:r>
     </w:p>
     <w:tbl>
@@ -20388,7 +20446,7 @@
               <w:rPr>
                 <w:sz w:val="18"/>
               </w:rPr>
-              <w:t>El archivo no trae la seccion de diagnosticos.</w:t>
+              <w:t>El archivo trae la seccion de diagnosticos, igual que en pantalla.</w:t>
             </w:r>
           </w:p>
         </w:tc>
@@ -20418,7 +20476,7 @@
               <w:rPr>
                 <w:sz w:val="18"/>
               </w:rPr>
-              <w:t>Exportar y abrir el .csv. No debe haber ningun nombre de diagnostico.</w:t>
+              <w:t>Entrar como jefatura, exportar y abrir el .csv. Debe listar los diagnosticos mas comunes.</w:t>
             </w:r>
           </w:p>
         </w:tc>
@@ -20497,7 +20555,7 @@
         <w:rPr>
           <w:sz w:val="18"/>
         </w:rPr>
-        <w:t>En espera de la decision A.1: si la jefatura debe ver los diagnosticos en pantalla, tambien en el .csv.</w:t>
+        <w:t>Resuelto por la migracion 20260930240000: la jefatura ya ve diagnosticos en REM. Si el .csv sale sin la seccion, es FALLA (la pantalla y la exportacion deben coincidir).</w:t>
       </w:r>
     </w:p>
     <w:p>
@@ -24373,7 +24431,7 @@
               <w:rPr>
                 <w:sz w:val="18"/>
               </w:rPr>
-              <w:t>jefatura.demo@swimyti.cl</w:t>
+              <w:t>jef, doc, enf, apoyo, pac</w:t>
             </w:r>
           </w:p>
         </w:tc>
@@ -24403,7 +24461,7 @@
               <w:rPr>
                 <w:sz w:val="18"/>
               </w:rPr>
-              <w:t>Ninguna respuesta incluye datos que ese rol no deba ver. Solo conteos agregados.</w:t>
+              <w:t>Jefatura y administrador reciben conteos agregados. Ningun otro rol recibe respuesta: 403. Nadie recibe la columna diagnostico cruda, solo el agregado top 5.</w:t>
             </w:r>
           </w:p>
         </w:tc>
@@ -24512,7 +24570,285 @@
         <w:rPr>
           <w:sz w:val="18"/>
         </w:rPr>
-        <w:t>En espera de la decision A.1: hoy el administrador es el unico que recibe diagnosticos. Si se cambia, este caso cambia de regla.</w:t>
+        <w:t>Resuelto por la migracion 20260930240000: jefatura y administracion ven ambos diagnosticos. Verificado por REST: los otros cinco roles reciben 42501 y la app lo muestra como error.</w:t>
+      </w:r>
+    </w:p>
+    <w:p>
+      <w:pPr>
+        <w:pStyle w:val="Heading2"/>
+      </w:pPr>
+      <w:r>
+        <w:t>6.16  Sin sesion no se puede leer la agenda</w:t>
+      </w:r>
+    </w:p>
+    <w:tbl>
+      <w:tblPr>
+        <w:tblStyle w:val="TableGrid"/>
+        <w:tblW w:type="auto" w:w="0"/>
+        <w:jc w:val="center"/>
+        <w:tblLook w:firstColumn="1" w:firstRow="1" w:lastColumn="0" w:lastRow="0" w:noHBand="0" w:noVBand="1" w:val="04A0"/>
+      </w:tblPr>
+      <w:tblGrid>
+        <w:gridCol w:w="4320"/>
+        <w:gridCol w:w="4320"/>
+      </w:tblGrid>
+      <w:tr>
+        <w:tc>
+          <w:tcPr>
+            <w:tcW w:type="dxa" w:w="4320"/>
+          </w:tcPr>
+          <w:p>
+            <w:r/>
+            <w:r>
+              <w:rPr>
+                <w:b/>
+                <w:sz w:val="18"/>
+              </w:rPr>
+              <w:t>Campo</w:t>
+            </w:r>
+          </w:p>
+        </w:tc>
+        <w:tc>
+          <w:tcPr>
+            <w:tcW w:type="dxa" w:w="4320"/>
+          </w:tcPr>
+          <w:p>
+            <w:r/>
+            <w:r>
+              <w:rPr>
+                <w:b/>
+                <w:sz w:val="18"/>
+              </w:rPr>
+              <w:t>Detalle</w:t>
+            </w:r>
+          </w:p>
+        </w:tc>
+      </w:tr>
+      <w:tr>
+        <w:tc>
+          <w:tcPr>
+            <w:tcW w:type="dxa" w:w="4320"/>
+          </w:tcPr>
+          <w:p>
+            <w:r/>
+            <w:r>
+              <w:rPr>
+                <w:sz w:val="18"/>
+              </w:rPr>
+              <w:t>Modulo</w:t>
+            </w:r>
+          </w:p>
+        </w:tc>
+        <w:tc>
+          <w:tcPr>
+            <w:tcW w:type="dxa" w:w="4320"/>
+          </w:tcPr>
+          <w:p>
+            <w:r/>
+            <w:r>
+              <w:rPr>
+                <w:sz w:val="18"/>
+              </w:rPr>
+              <w:t>Agenda    cualquiera</w:t>
+            </w:r>
+          </w:p>
+        </w:tc>
+      </w:tr>
+      <w:tr>
+        <w:tc>
+          <w:tcPr>
+            <w:tcW w:type="dxa" w:w="4320"/>
+          </w:tcPr>
+          <w:p>
+            <w:r/>
+            <w:r>
+              <w:rPr>
+                <w:sz w:val="18"/>
+              </w:rPr>
+              <w:t>Paso</w:t>
+            </w:r>
+          </w:p>
+        </w:tc>
+        <w:tc>
+          <w:tcPr>
+            <w:tcW w:type="dxa" w:w="4320"/>
+          </w:tcPr>
+          <w:p>
+            <w:r/>
+            <w:r>
+              <w:rPr>
+                <w:sz w:val="18"/>
+              </w:rPr>
+              <w:t>Pestana anonima del navegador, sin iniciar sesion</w:t>
+            </w:r>
+          </w:p>
+        </w:tc>
+      </w:tr>
+      <w:tr>
+        <w:tc>
+          <w:tcPr>
+            <w:tcW w:type="dxa" w:w="4320"/>
+          </w:tcPr>
+          <w:p>
+            <w:r/>
+            <w:r>
+              <w:rPr>
+                <w:sz w:val="18"/>
+              </w:rPr>
+              <w:t>Cuenta</w:t>
+            </w:r>
+          </w:p>
+        </w:tc>
+        <w:tc>
+          <w:tcPr>
+            <w:tcW w:type="dxa" w:w="4320"/>
+          </w:tcPr>
+          <w:p>
+            <w:r/>
+            <w:r>
+              <w:rPr>
+                <w:sz w:val="18"/>
+              </w:rPr>
+              <w:t>-</w:t>
+            </w:r>
+          </w:p>
+        </w:tc>
+      </w:tr>
+      <w:tr>
+        <w:tc>
+          <w:tcPr>
+            <w:tcW w:type="dxa" w:w="4320"/>
+          </w:tcPr>
+          <w:p>
+            <w:r/>
+            <w:r>
+              <w:rPr>
+                <w:sz w:val="18"/>
+              </w:rPr>
+              <w:t>Debe ocurrir</w:t>
+            </w:r>
+          </w:p>
+        </w:tc>
+        <w:tc>
+          <w:tcPr>
+            <w:tcW w:type="dxa" w:w="4320"/>
+          </w:tcPr>
+          <w:p>
+            <w:r/>
+            <w:r>
+              <w:rPr>
+                <w:sz w:val="18"/>
+              </w:rPr>
+              <w:t>La consulta a la agenda devuelve vacio. No se enumeran bloques, profesionales ni capacidad.</w:t>
+            </w:r>
+          </w:p>
+        </w:tc>
+      </w:tr>
+      <w:tr>
+        <w:tc>
+          <w:tcPr>
+            <w:tcW w:type="dxa" w:w="4320"/>
+          </w:tcPr>
+          <w:p>
+            <w:r/>
+            <w:r>
+              <w:rPr>
+                <w:sz w:val="18"/>
+              </w:rPr>
+              <w:t>Como se comprueba</w:t>
+            </w:r>
+          </w:p>
+        </w:tc>
+        <w:tc>
+          <w:tcPr>
+            <w:tcW w:type="dxa" w:w="4320"/>
+          </w:tcPr>
+          <w:p>
+            <w:r/>
+            <w:r>
+              <w:rPr>
+                <w:sz w:val="18"/>
+              </w:rPr>
+              <w:t>Sin sesion, en DevTools, ejecutar la consulta de la agenda. Debe devolver lista vacia. Es una regresion de la migracion 20260930240000.</w:t>
+            </w:r>
+          </w:p>
+        </w:tc>
+      </w:tr>
+      <w:tr>
+        <w:tc>
+          <w:tcPr>
+            <w:tcW w:type="dxa" w:w="4320"/>
+          </w:tcPr>
+          <w:p>
+            <w:r/>
+            <w:r>
+              <w:rPr>
+                <w:sz w:val="18"/>
+              </w:rPr>
+              <w:t>Riesgo</w:t>
+            </w:r>
+          </w:p>
+        </w:tc>
+        <w:tc>
+          <w:tcPr>
+            <w:tcW w:type="dxa" w:w="4320"/>
+          </w:tcPr>
+          <w:p>
+            <w:r/>
+            <w:r>
+              <w:rPr>
+                <w:sz w:val="18"/>
+              </w:rPr>
+              <w:t>Solo lectura</w:t>
+            </w:r>
+          </w:p>
+        </w:tc>
+      </w:tr>
+      <w:tr>
+        <w:tc>
+          <w:tcPr>
+            <w:tcW w:type="dxa" w:w="4320"/>
+          </w:tcPr>
+          <w:p>
+            <w:r/>
+            <w:r>
+              <w:rPr>
+                <w:sz w:val="18"/>
+              </w:rPr>
+              <w:t>Resultado</w:t>
+            </w:r>
+          </w:p>
+        </w:tc>
+        <w:tc>
+          <w:tcPr>
+            <w:tcW w:type="dxa" w:w="4320"/>
+          </w:tcPr>
+          <w:p>
+            <w:r/>
+            <w:r>
+              <w:rPr>
+                <w:sz w:val="18"/>
+              </w:rPr>
+              <w:t>[   ] OK          [   ] FALLA          [   ] No ejecutado</w:t>
+            </w:r>
+          </w:p>
+        </w:tc>
+      </w:tr>
+    </w:tbl>
+    <w:p/>
+    <w:p>
+      <w:r>
+        <w:rPr>
+          <w:b/>
+          <w:sz w:val="18"/>
+        </w:rPr>
+        <w:t xml:space="preserve">Observaciones previas: </w:t>
+      </w:r>
+      <w:r>
+        <w:rPr>
+          <w:sz w:val="18"/>
+        </w:rPr>
+        <w:t>Verificado por REST tras aplicar: anon devuelve cuerpo vacio y Content-Range '*/*'; un usuario autenticado si ve los 6076 bloques. Si anon los ve, es FALLA CRITICA.</w:t>
       </w:r>
     </w:p>
     <w:p>

</xml_diff>